<commit_message>
update pergantian sabtu 2
</commit_message>
<xml_diff>
--- a/resources/templates/template-form-user.docx
+++ b/resources/templates/template-form-user.docx
@@ -1883,7 +1883,6 @@
                     <w14:uncheckedState w14:val="2610" w14:font="MS Gothic"/>
                   </w14:checkbox>
                 </w:sdtPr>
-                <w:sdtEndPr/>
                 <w:sdtContent>
                   <w:tc>
                     <w:tcPr>
@@ -1991,7 +1990,6 @@
                     <w14:uncheckedState w14:val="2610" w14:font="MS Gothic"/>
                   </w14:checkbox>
                 </w:sdtPr>
-                <w:sdtEndPr/>
                 <w:sdtContent>
                   <w:tc>
                     <w:tcPr>
@@ -2105,7 +2103,6 @@
                     <w14:uncheckedState w14:val="2610" w14:font="MS Gothic"/>
                   </w14:checkbox>
                 </w:sdtPr>
-                <w:sdtEndPr/>
                 <w:sdtContent>
                   <w:tc>
                     <w:tcPr>
@@ -2193,7 +2190,6 @@
                     <w14:uncheckedState w14:val="2610" w14:font="MS Gothic"/>
                   </w14:checkbox>
                 </w:sdtPr>
-                <w:sdtEndPr/>
                 <w:sdtContent>
                   <w:tc>
                     <w:tcPr>
@@ -2287,7 +2283,6 @@
                     <w14:uncheckedState w14:val="2610" w14:font="MS Gothic"/>
                   </w14:checkbox>
                 </w:sdtPr>
-                <w:sdtEndPr/>
                 <w:sdtContent>
                   <w:tc>
                     <w:tcPr>
@@ -3938,18 +3933,18 @@
               <w:tblLook w:val="04A0" w:firstRow="1" w:lastRow="0" w:firstColumn="1" w:lastColumn="0" w:noHBand="0" w:noVBand="1"/>
             </w:tblPr>
             <w:tblGrid>
-              <w:gridCol w:w="1271"/>
+              <w:gridCol w:w="1554"/>
+              <w:gridCol w:w="1418"/>
+              <w:gridCol w:w="1275"/>
+              <w:gridCol w:w="1701"/>
+              <w:gridCol w:w="1418"/>
               <w:gridCol w:w="1417"/>
-              <w:gridCol w:w="856"/>
-              <w:gridCol w:w="1417"/>
-              <w:gridCol w:w="1838"/>
-              <w:gridCol w:w="1559"/>
-              <w:gridCol w:w="1559"/>
+              <w:gridCol w:w="1134"/>
             </w:tblGrid>
             <w:tr>
               <w:tc>
                 <w:tcPr>
-                  <w:tcW w:w="2688" w:type="dxa"/>
+                  <w:tcW w:w="2972" w:type="dxa"/>
                   <w:gridSpan w:val="2"/>
                   <w:shd w:val="clear" w:color="auto" w:fill="44546A" w:themeFill="text2"/>
                 </w:tcPr>
@@ -3982,7 +3977,7 @@
               </w:tc>
               <w:tc>
                 <w:tcPr>
-                  <w:tcW w:w="2273" w:type="dxa"/>
+                  <w:tcW w:w="2976" w:type="dxa"/>
                   <w:gridSpan w:val="2"/>
                   <w:shd w:val="clear" w:color="auto" w:fill="44546A" w:themeFill="text2"/>
                 </w:tcPr>
@@ -4015,7 +4010,7 @@
               </w:tc>
               <w:tc>
                 <w:tcPr>
-                  <w:tcW w:w="3397" w:type="dxa"/>
+                  <w:tcW w:w="2835" w:type="dxa"/>
                   <w:gridSpan w:val="2"/>
                   <w:shd w:val="clear" w:color="auto" w:fill="44546A" w:themeFill="text2"/>
                 </w:tcPr>
@@ -4048,7 +4043,7 @@
               </w:tc>
               <w:tc>
                 <w:tcPr>
-                  <w:tcW w:w="1559" w:type="dxa"/>
+                  <w:tcW w:w="1134" w:type="dxa"/>
                   <w:vMerge w:val="restart"/>
                   <w:shd w:val="clear" w:color="auto" w:fill="44546A" w:themeFill="text2"/>
                 </w:tcPr>
@@ -4083,7 +4078,7 @@
             <w:tr>
               <w:tc>
                 <w:tcPr>
-                  <w:tcW w:w="1271" w:type="dxa"/>
+                  <w:tcW w:w="1554" w:type="dxa"/>
                   <w:shd w:val="clear" w:color="auto" w:fill="44546A" w:themeFill="text2"/>
                 </w:tcPr>
                 <w:p>
@@ -4122,6 +4117,146 @@
                       <w:lang w:val="id-ID"/>
                     </w:rPr>
                     <w:t>Name</w:t>
+                  </w:r>
+                </w:p>
+              </w:tc>
+              <w:tc>
+                <w:tcPr>
+                  <w:tcW w:w="1418" w:type="dxa"/>
+                  <w:shd w:val="clear" w:color="auto" w:fill="44546A" w:themeFill="text2"/>
+                </w:tcPr>
+                <w:p>
+                  <w:pPr>
+                    <w:jc w:val="center"/>
+                    <w:rPr>
+                      <w:rFonts w:ascii="Aptos Display" w:eastAsia="Arial" w:hAnsi="Aptos Display" w:cs="Arial"/>
+                      <w:b/>
+                      <w:color w:val="FFFFFF" w:themeColor="background1"/>
+                      <w:spacing w:val="-3"/>
+                      <w:sz w:val="22"/>
+                      <w:szCs w:val="22"/>
+                      <w:lang w:val="id-ID"/>
+                    </w:rPr>
+                  </w:pPr>
+                  <w:r>
+                    <w:rPr>
+                      <w:rFonts w:ascii="Aptos Display" w:eastAsia="Arial" w:hAnsi="Aptos Display" w:cs="Arial"/>
+                      <w:b/>
+                      <w:color w:val="FFFFFF" w:themeColor="background1"/>
+                      <w:spacing w:val="-3"/>
+                      <w:sz w:val="22"/>
+                      <w:szCs w:val="22"/>
+                      <w:lang w:val="id-ID"/>
+                    </w:rPr>
+                    <w:t>Nama Lengkap</w:t>
+                  </w:r>
+                </w:p>
+              </w:tc>
+              <w:tc>
+                <w:tcPr>
+                  <w:tcW w:w="1275" w:type="dxa"/>
+                  <w:shd w:val="clear" w:color="auto" w:fill="44546A" w:themeFill="text2"/>
+                </w:tcPr>
+                <w:p>
+                  <w:pPr>
+                    <w:jc w:val="center"/>
+                    <w:rPr>
+                      <w:rFonts w:ascii="Aptos Display" w:eastAsia="Arial" w:hAnsi="Aptos Display" w:cs="Arial"/>
+                      <w:b/>
+                      <w:color w:val="FFFFFF" w:themeColor="background1"/>
+                      <w:spacing w:val="-3"/>
+                      <w:sz w:val="22"/>
+                      <w:szCs w:val="22"/>
+                      <w:lang w:val="id-ID"/>
+                    </w:rPr>
+                  </w:pPr>
+                  <w:r>
+                    <w:rPr>
+                      <w:rFonts w:ascii="Aptos Display" w:eastAsia="Arial" w:hAnsi="Aptos Display" w:cs="Arial"/>
+                      <w:b/>
+                      <w:color w:val="FFFFFF" w:themeColor="background1"/>
+                      <w:spacing w:val="-3"/>
+                      <w:sz w:val="22"/>
+                      <w:szCs w:val="22"/>
+                      <w:lang w:val="id-ID"/>
+                    </w:rPr>
+                    <w:t xml:space="preserve">User </w:t>
+                  </w:r>
+                  <w:r>
+                    <w:rPr>
+                      <w:rFonts w:ascii="Aptos Display" w:eastAsia="Arial" w:hAnsi="Aptos Display" w:cs="Arial"/>
+                      <w:b/>
+                      <w:color w:val="FFFFFF" w:themeColor="background1"/>
+                      <w:spacing w:val="-3"/>
+                      <w:sz w:val="22"/>
+                      <w:szCs w:val="22"/>
+                      <w:lang w:val="id-ID"/>
+                    </w:rPr>
+                    <w:t>Name</w:t>
+                  </w:r>
+                </w:p>
+              </w:tc>
+              <w:tc>
+                <w:tcPr>
+                  <w:tcW w:w="1701" w:type="dxa"/>
+                  <w:shd w:val="clear" w:color="auto" w:fill="44546A" w:themeFill="text2"/>
+                </w:tcPr>
+                <w:p>
+                  <w:pPr>
+                    <w:jc w:val="center"/>
+                    <w:rPr>
+                      <w:rFonts w:ascii="Aptos Display" w:eastAsia="Arial" w:hAnsi="Aptos Display" w:cs="Arial"/>
+                      <w:b/>
+                      <w:color w:val="FFFFFF" w:themeColor="background1"/>
+                      <w:spacing w:val="-3"/>
+                      <w:sz w:val="22"/>
+                      <w:szCs w:val="22"/>
+                      <w:lang w:val="id-ID"/>
+                    </w:rPr>
+                  </w:pPr>
+                  <w:r>
+                    <w:rPr>
+                      <w:rFonts w:ascii="Aptos Display" w:eastAsia="Arial" w:hAnsi="Aptos Display" w:cs="Arial"/>
+                      <w:b/>
+                      <w:color w:val="FFFFFF" w:themeColor="background1"/>
+                      <w:spacing w:val="-3"/>
+                      <w:sz w:val="22"/>
+                      <w:szCs w:val="22"/>
+                      <w:lang w:val="id-ID"/>
+                    </w:rPr>
+                    <w:t>Nama Lengkap</w:t>
+                  </w:r>
+                </w:p>
+              </w:tc>
+              <w:tc>
+                <w:tcPr>
+                  <w:tcW w:w="1418" w:type="dxa"/>
+                  <w:shd w:val="clear" w:color="auto" w:fill="44546A" w:themeFill="text2"/>
+                </w:tcPr>
+                <w:p>
+                  <w:pPr>
+                    <w:jc w:val="center"/>
+                    <w:rPr>
+                      <w:rFonts w:ascii="Aptos Display" w:eastAsia="Arial" w:hAnsi="Aptos Display" w:cs="Arial"/>
+                      <w:b/>
+                      <w:color w:val="FFFFFF" w:themeColor="background1"/>
+                      <w:spacing w:val="-3"/>
+                      <w:sz w:val="22"/>
+                      <w:szCs w:val="22"/>
+                      <w:lang w:val="id-ID"/>
+                    </w:rPr>
+                  </w:pPr>
+                  <w:r>
+                    <w:rPr>
+                      <w:rFonts w:ascii="Aptos Display" w:eastAsia="Arial" w:hAnsi="Aptos Display" w:cs="Arial"/>
+                      <w:b/>
+                      <w:color w:val="FFFFFF" w:themeColor="background1"/>
+                      <w:spacing w:val="-3"/>
+                      <w:sz w:val="22"/>
+                      <w:szCs w:val="22"/>
+                      <w:lang w:val="id-ID"/>
+                    </w:rPr>
+                    <w:t>Mulai</w:t>
                   </w:r>
                 </w:p>
               </w:tc>
@@ -4153,153 +4288,13 @@
                       <w:szCs w:val="22"/>
                       <w:lang w:val="id-ID"/>
                     </w:rPr>
-                    <w:t>Nama Lengkap</w:t>
-                  </w:r>
-                </w:p>
-              </w:tc>
-              <w:tc>
-                <w:tcPr>
-                  <w:tcW w:w="856" w:type="dxa"/>
-                  <w:shd w:val="clear" w:color="auto" w:fill="44546A" w:themeFill="text2"/>
-                </w:tcPr>
-                <w:p>
-                  <w:pPr>
-                    <w:jc w:val="center"/>
-                    <w:rPr>
-                      <w:rFonts w:ascii="Aptos Display" w:eastAsia="Arial" w:hAnsi="Aptos Display" w:cs="Arial"/>
-                      <w:b/>
-                      <w:color w:val="FFFFFF" w:themeColor="background1"/>
-                      <w:spacing w:val="-3"/>
-                      <w:sz w:val="22"/>
-                      <w:szCs w:val="22"/>
-                      <w:lang w:val="id-ID"/>
-                    </w:rPr>
-                  </w:pPr>
-                  <w:r>
-                    <w:rPr>
-                      <w:rFonts w:ascii="Aptos Display" w:eastAsia="Arial" w:hAnsi="Aptos Display" w:cs="Arial"/>
-                      <w:b/>
-                      <w:color w:val="FFFFFF" w:themeColor="background1"/>
-                      <w:spacing w:val="-3"/>
-                      <w:sz w:val="22"/>
-                      <w:szCs w:val="22"/>
-                      <w:lang w:val="id-ID"/>
-                    </w:rPr>
-                    <w:t xml:space="preserve">User </w:t>
-                  </w:r>
-                  <w:r>
-                    <w:rPr>
-                      <w:rFonts w:ascii="Aptos Display" w:eastAsia="Arial" w:hAnsi="Aptos Display" w:cs="Arial"/>
-                      <w:b/>
-                      <w:color w:val="FFFFFF" w:themeColor="background1"/>
-                      <w:spacing w:val="-3"/>
-                      <w:sz w:val="22"/>
-                      <w:szCs w:val="22"/>
-                      <w:lang w:val="id-ID"/>
-                    </w:rPr>
-                    <w:t>Name</w:t>
-                  </w:r>
-                </w:p>
-              </w:tc>
-              <w:tc>
-                <w:tcPr>
-                  <w:tcW w:w="1417" w:type="dxa"/>
-                  <w:shd w:val="clear" w:color="auto" w:fill="44546A" w:themeFill="text2"/>
-                </w:tcPr>
-                <w:p>
-                  <w:pPr>
-                    <w:jc w:val="center"/>
-                    <w:rPr>
-                      <w:rFonts w:ascii="Aptos Display" w:eastAsia="Arial" w:hAnsi="Aptos Display" w:cs="Arial"/>
-                      <w:b/>
-                      <w:color w:val="FFFFFF" w:themeColor="background1"/>
-                      <w:spacing w:val="-3"/>
-                      <w:sz w:val="22"/>
-                      <w:szCs w:val="22"/>
-                      <w:lang w:val="id-ID"/>
-                    </w:rPr>
-                  </w:pPr>
-                  <w:r>
-                    <w:rPr>
-                      <w:rFonts w:ascii="Aptos Display" w:eastAsia="Arial" w:hAnsi="Aptos Display" w:cs="Arial"/>
-                      <w:b/>
-                      <w:color w:val="FFFFFF" w:themeColor="background1"/>
-                      <w:spacing w:val="-3"/>
-                      <w:sz w:val="22"/>
-                      <w:szCs w:val="22"/>
-                      <w:lang w:val="id-ID"/>
-                    </w:rPr>
-                    <w:t>Nama Lengkap</w:t>
-                  </w:r>
-                </w:p>
-              </w:tc>
-              <w:tc>
-                <w:tcPr>
-                  <w:tcW w:w="1838" w:type="dxa"/>
-                  <w:shd w:val="clear" w:color="auto" w:fill="44546A" w:themeFill="text2"/>
-                </w:tcPr>
-                <w:p>
-                  <w:pPr>
-                    <w:jc w:val="center"/>
-                    <w:rPr>
-                      <w:rFonts w:ascii="Aptos Display" w:eastAsia="Arial" w:hAnsi="Aptos Display" w:cs="Arial"/>
-                      <w:b/>
-                      <w:color w:val="FFFFFF" w:themeColor="background1"/>
-                      <w:spacing w:val="-3"/>
-                      <w:sz w:val="22"/>
-                      <w:szCs w:val="22"/>
-                      <w:lang w:val="id-ID"/>
-                    </w:rPr>
-                  </w:pPr>
-                  <w:r>
-                    <w:rPr>
-                      <w:rFonts w:ascii="Aptos Display" w:eastAsia="Arial" w:hAnsi="Aptos Display" w:cs="Arial"/>
-                      <w:b/>
-                      <w:color w:val="FFFFFF" w:themeColor="background1"/>
-                      <w:spacing w:val="-3"/>
-                      <w:sz w:val="22"/>
-                      <w:szCs w:val="22"/>
-                      <w:lang w:val="id-ID"/>
-                    </w:rPr>
-                    <w:t>Mulai</w:t>
-                  </w:r>
-                </w:p>
-              </w:tc>
-              <w:tc>
-                <w:tcPr>
-                  <w:tcW w:w="1559" w:type="dxa"/>
-                  <w:shd w:val="clear" w:color="auto" w:fill="44546A" w:themeFill="text2"/>
-                </w:tcPr>
-                <w:p>
-                  <w:pPr>
-                    <w:jc w:val="center"/>
-                    <w:rPr>
-                      <w:rFonts w:ascii="Aptos Display" w:eastAsia="Arial" w:hAnsi="Aptos Display" w:cs="Arial"/>
-                      <w:b/>
-                      <w:color w:val="FFFFFF" w:themeColor="background1"/>
-                      <w:spacing w:val="-3"/>
-                      <w:sz w:val="22"/>
-                      <w:szCs w:val="22"/>
-                      <w:lang w:val="id-ID"/>
-                    </w:rPr>
-                  </w:pPr>
-                  <w:r>
-                    <w:rPr>
-                      <w:rFonts w:ascii="Aptos Display" w:eastAsia="Arial" w:hAnsi="Aptos Display" w:cs="Arial"/>
-                      <w:b/>
-                      <w:color w:val="FFFFFF" w:themeColor="background1"/>
-                      <w:spacing w:val="-3"/>
-                      <w:sz w:val="22"/>
-                      <w:szCs w:val="22"/>
-                      <w:lang w:val="id-ID"/>
-                    </w:rPr>
                     <w:t>Selesai</w:t>
                   </w:r>
                 </w:p>
               </w:tc>
               <w:tc>
                 <w:tcPr>
-                  <w:tcW w:w="1559" w:type="dxa"/>
+                  <w:tcW w:w="1134" w:type="dxa"/>
                   <w:vMerge/>
                   <w:shd w:val="clear" w:color="auto" w:fill="44546A" w:themeFill="text2"/>
                 </w:tcPr>
@@ -4322,7 +4317,7 @@
             <w:tr>
               <w:tc>
                 <w:tcPr>
-                  <w:tcW w:w="1271" w:type="dxa"/>
+                  <w:tcW w:w="1554" w:type="dxa"/>
                 </w:tcPr>
                 <w:p>
                   <w:pPr>
@@ -4346,6 +4341,143 @@
                       <w:lang w:val="id-ID"/>
                     </w:rPr>
                     <w:t>$pergantian_users.user_name</w:t>
+                  </w:r>
+                </w:p>
+              </w:tc>
+              <w:tc>
+                <w:tcPr>
+                  <w:tcW w:w="1418" w:type="dxa"/>
+                </w:tcPr>
+                <w:p>
+                  <w:pPr>
+                    <w:jc w:val="center"/>
+                    <w:rPr>
+                      <w:rFonts w:ascii="Aptos Display" w:eastAsia="Arial" w:hAnsi="Aptos Display" w:cs="Arial"/>
+                      <w:b/>
+                      <w:spacing w:val="-3"/>
+                      <w:sz w:val="22"/>
+                      <w:szCs w:val="22"/>
+                      <w:lang w:val="id-ID"/>
+                    </w:rPr>
+                  </w:pPr>
+                  <w:r>
+                    <w:rPr>
+                      <w:rFonts w:ascii="Aptos Display" w:eastAsia="Arial" w:hAnsi="Aptos Display" w:cs="Arial"/>
+                      <w:b/>
+                      <w:spacing w:val="-3"/>
+                      <w:sz w:val="22"/>
+                      <w:szCs w:val="22"/>
+                      <w:lang w:val="id-ID"/>
+                    </w:rPr>
+                    <w:t>J</w:t>
+                  </w:r>
+                  <w:r>
+                    <w:rPr>
+                      <w:rFonts w:ascii="Aptos Display" w:eastAsia="Arial" w:hAnsi="Aptos Display" w:cs="Arial"/>
+                      <w:b/>
+                      <w:spacing w:val="-3"/>
+                      <w:sz w:val="22"/>
+                      <w:szCs w:val="22"/>
+                      <w:lang w:val="id-ID"/>
+                    </w:rPr>
+                    <w:t>$pergantian_users.</w:t>
+                  </w:r>
+                  <w:r>
+                    <w:rPr>
+                      <w:rFonts w:ascii="Aptos Display" w:eastAsia="Arial" w:hAnsi="Aptos Display" w:cs="Arial"/>
+                      <w:b/>
+                      <w:spacing w:val="-3"/>
+                      <w:sz w:val="22"/>
+                      <w:szCs w:val="22"/>
+                      <w:lang w:val="id-ID"/>
+                    </w:rPr>
+                    <w:t>nama_lengkap</w:t>
+                  </w:r>
+                </w:p>
+              </w:tc>
+              <w:tc>
+                <w:tcPr>
+                  <w:tcW w:w="1275" w:type="dxa"/>
+                </w:tcPr>
+                <w:p>
+                  <w:pPr>
+                    <w:jc w:val="center"/>
+                    <w:rPr>
+                      <w:rFonts w:ascii="Aptos Display" w:eastAsia="Arial" w:hAnsi="Aptos Display" w:cs="Arial"/>
+                      <w:b/>
+                      <w:spacing w:val="-3"/>
+                      <w:sz w:val="22"/>
+                      <w:szCs w:val="22"/>
+                      <w:lang w:val="id-ID"/>
+                    </w:rPr>
+                  </w:pPr>
+                  <w:r>
+                    <w:rPr>
+                      <w:rFonts w:ascii="Aptos Display" w:eastAsia="Arial" w:hAnsi="Aptos Display" w:cs="Arial"/>
+                      <w:b/>
+                      <w:spacing w:val="-3"/>
+                      <w:sz w:val="22"/>
+                      <w:szCs w:val="22"/>
+                      <w:lang w:val="id-ID"/>
+                    </w:rPr>
+                    <w:t>$pergantian_users.user_name</w:t>
+                  </w:r>
+                </w:p>
+              </w:tc>
+              <w:tc>
+                <w:tcPr>
+                  <w:tcW w:w="1701" w:type="dxa"/>
+                </w:tcPr>
+                <w:p>
+                  <w:pPr>
+                    <w:jc w:val="center"/>
+                    <w:rPr>
+                      <w:rFonts w:ascii="Aptos Display" w:eastAsia="Arial" w:hAnsi="Aptos Display" w:cs="Arial"/>
+                      <w:b/>
+                      <w:spacing w:val="-3"/>
+                      <w:sz w:val="22"/>
+                      <w:szCs w:val="22"/>
+                      <w:lang w:val="id-ID"/>
+                    </w:rPr>
+                  </w:pPr>
+                  <w:r>
+                    <w:rPr>
+                      <w:rFonts w:ascii="Aptos Display" w:eastAsia="Arial" w:hAnsi="Aptos Display" w:cs="Arial"/>
+                      <w:b/>
+                      <w:spacing w:val="-3"/>
+                      <w:sz w:val="22"/>
+                      <w:szCs w:val="22"/>
+                      <w:lang w:val="id-ID"/>
+                    </w:rPr>
+                    <w:t>J$pergantian_users.nama_lengkap</w:t>
+                  </w:r>
+                </w:p>
+              </w:tc>
+              <w:tc>
+                <w:tcPr>
+                  <w:tcW w:w="1418" w:type="dxa"/>
+                </w:tcPr>
+                <w:p>
+                  <w:pPr>
+                    <w:rPr>
+                      <w:rFonts w:ascii="Aptos Display" w:eastAsia="Arial" w:hAnsi="Aptos Display" w:cs="Arial"/>
+                      <w:b/>
+                      <w:spacing w:val="-3"/>
+                      <w:sz w:val="22"/>
+                      <w:szCs w:val="22"/>
+                      <w:lang w:val="id-ID"/>
+                    </w:rPr>
+                  </w:pPr>
+                  <w:r>
+                    <w:rPr>
+                      <w:rFonts w:ascii="Aptos Display" w:eastAsia="Arial" w:hAnsi="Aptos Display" w:cs="Arial"/>
+                      <w:b/>
+                      <w:spacing w:val="-3"/>
+                      <w:sz w:val="22"/>
+                      <w:szCs w:val="22"/>
+                      <w:lang w:val="id-ID"/>
+                    </w:rPr>
+                    <w:t>$tanggal mulai</w:t>
                   </w:r>
                 </w:p>
               </w:tc>
@@ -4374,150 +4506,13 @@
                       <w:szCs w:val="22"/>
                       <w:lang w:val="id-ID"/>
                     </w:rPr>
-                    <w:t>J</w:t>
-                  </w:r>
-                  <w:r>
-                    <w:rPr>
-                      <w:rFonts w:ascii="Aptos Display" w:eastAsia="Arial" w:hAnsi="Aptos Display" w:cs="Arial"/>
-                      <w:b/>
-                      <w:spacing w:val="-3"/>
-                      <w:sz w:val="22"/>
-                      <w:szCs w:val="22"/>
-                      <w:lang w:val="id-ID"/>
-                    </w:rPr>
-                    <w:t>$pergantian_users.</w:t>
-                  </w:r>
-                  <w:r>
-                    <w:rPr>
-                      <w:rFonts w:ascii="Aptos Display" w:eastAsia="Arial" w:hAnsi="Aptos Display" w:cs="Arial"/>
-                      <w:b/>
-                      <w:spacing w:val="-3"/>
-                      <w:sz w:val="22"/>
-                      <w:szCs w:val="22"/>
-                      <w:lang w:val="id-ID"/>
-                    </w:rPr>
-                    <w:t>nama_lengkap</w:t>
-                  </w:r>
-                </w:p>
-              </w:tc>
-              <w:tc>
-                <w:tcPr>
-                  <w:tcW w:w="856" w:type="dxa"/>
-                </w:tcPr>
-                <w:p>
-                  <w:pPr>
-                    <w:jc w:val="center"/>
-                    <w:rPr>
-                      <w:rFonts w:ascii="Aptos Display" w:eastAsia="Arial" w:hAnsi="Aptos Display" w:cs="Arial"/>
-                      <w:b/>
-                      <w:spacing w:val="-3"/>
-                      <w:sz w:val="22"/>
-                      <w:szCs w:val="22"/>
-                      <w:lang w:val="id-ID"/>
-                    </w:rPr>
-                  </w:pPr>
-                  <w:r>
-                    <w:rPr>
-                      <w:rFonts w:ascii="Aptos Display" w:eastAsia="Arial" w:hAnsi="Aptos Display" w:cs="Arial"/>
-                      <w:b/>
-                      <w:spacing w:val="-3"/>
-                      <w:sz w:val="22"/>
-                      <w:szCs w:val="22"/>
-                      <w:lang w:val="id-ID"/>
-                    </w:rPr>
-                    <w:t>$pergantian_users.user_name</w:t>
-                  </w:r>
-                </w:p>
-              </w:tc>
-              <w:tc>
-                <w:tcPr>
-                  <w:tcW w:w="1417" w:type="dxa"/>
-                </w:tcPr>
-                <w:p>
-                  <w:pPr>
-                    <w:jc w:val="center"/>
-                    <w:rPr>
-                      <w:rFonts w:ascii="Aptos Display" w:eastAsia="Arial" w:hAnsi="Aptos Display" w:cs="Arial"/>
-                      <w:b/>
-                      <w:spacing w:val="-3"/>
-                      <w:sz w:val="22"/>
-                      <w:szCs w:val="22"/>
-                      <w:lang w:val="id-ID"/>
-                    </w:rPr>
-                  </w:pPr>
-                  <w:r>
-                    <w:rPr>
-                      <w:rFonts w:ascii="Aptos Display" w:eastAsia="Arial" w:hAnsi="Aptos Display" w:cs="Arial"/>
-                      <w:b/>
-                      <w:spacing w:val="-3"/>
-                      <w:sz w:val="22"/>
-                      <w:szCs w:val="22"/>
-                      <w:lang w:val="id-ID"/>
-                    </w:rPr>
-                    <w:t>J$pergantian_users.nama_lengkap</w:t>
-                  </w:r>
-                </w:p>
-              </w:tc>
-              <w:tc>
-                <w:tcPr>
-                  <w:tcW w:w="1838" w:type="dxa"/>
-                </w:tcPr>
-                <w:p>
-                  <w:pPr>
-                    <w:rPr>
-                      <w:rFonts w:ascii="Aptos Display" w:eastAsia="Arial" w:hAnsi="Aptos Display" w:cs="Arial"/>
-                      <w:b/>
-                      <w:spacing w:val="-3"/>
-                      <w:sz w:val="22"/>
-                      <w:szCs w:val="22"/>
-                      <w:lang w:val="id-ID"/>
-                    </w:rPr>
-                  </w:pPr>
-                  <w:r>
-                    <w:rPr>
-                      <w:rFonts w:ascii="Aptos Display" w:eastAsia="Arial" w:hAnsi="Aptos Display" w:cs="Arial"/>
-                      <w:b/>
-                      <w:spacing w:val="-3"/>
-                      <w:sz w:val="22"/>
-                      <w:szCs w:val="22"/>
-                      <w:lang w:val="id-ID"/>
-                    </w:rPr>
-                    <w:t>$tanggal mulai</w:t>
-                  </w:r>
-                </w:p>
-              </w:tc>
-              <w:tc>
-                <w:tcPr>
-                  <w:tcW w:w="1559" w:type="dxa"/>
-                </w:tcPr>
-                <w:p>
-                  <w:pPr>
-                    <w:jc w:val="center"/>
-                    <w:rPr>
-                      <w:rFonts w:ascii="Aptos Display" w:eastAsia="Arial" w:hAnsi="Aptos Display" w:cs="Arial"/>
-                      <w:b/>
-                      <w:spacing w:val="-3"/>
-                      <w:sz w:val="22"/>
-                      <w:szCs w:val="22"/>
-                      <w:lang w:val="id-ID"/>
-                    </w:rPr>
-                  </w:pPr>
-                  <w:r>
-                    <w:rPr>
-                      <w:rFonts w:ascii="Aptos Display" w:eastAsia="Arial" w:hAnsi="Aptos Display" w:cs="Arial"/>
-                      <w:b/>
-                      <w:spacing w:val="-3"/>
-                      <w:sz w:val="22"/>
-                      <w:szCs w:val="22"/>
-                      <w:lang w:val="id-ID"/>
-                    </w:rPr>
                     <w:t>$tanggal selesai</w:t>
                   </w:r>
                 </w:p>
               </w:tc>
               <w:tc>
                 <w:tcPr>
-                  <w:tcW w:w="1559" w:type="dxa"/>
+                  <w:tcW w:w="1134" w:type="dxa"/>
                 </w:tcPr>
                 <w:p>
                   <w:pPr>
@@ -4537,7 +4532,79 @@
             <w:tr>
               <w:tc>
                 <w:tcPr>
-                  <w:tcW w:w="1271" w:type="dxa"/>
+                  <w:tcW w:w="1554" w:type="dxa"/>
+                </w:tcPr>
+                <w:p>
+                  <w:pPr>
+                    <w:jc w:val="center"/>
+                    <w:rPr>
+                      <w:rFonts w:ascii="Aptos Display" w:eastAsia="Arial" w:hAnsi="Aptos Display" w:cs="Arial"/>
+                      <w:b/>
+                      <w:spacing w:val="-3"/>
+                      <w:sz w:val="22"/>
+                      <w:szCs w:val="22"/>
+                      <w:lang w:val="id-ID"/>
+                    </w:rPr>
+                  </w:pPr>
+                </w:p>
+              </w:tc>
+              <w:tc>
+                <w:tcPr>
+                  <w:tcW w:w="1418" w:type="dxa"/>
+                </w:tcPr>
+                <w:p>
+                  <w:pPr>
+                    <w:jc w:val="center"/>
+                    <w:rPr>
+                      <w:rFonts w:ascii="Aptos Display" w:eastAsia="Arial" w:hAnsi="Aptos Display" w:cs="Arial"/>
+                      <w:b/>
+                      <w:spacing w:val="-3"/>
+                      <w:sz w:val="22"/>
+                      <w:szCs w:val="22"/>
+                      <w:lang w:val="id-ID"/>
+                    </w:rPr>
+                  </w:pPr>
+                </w:p>
+              </w:tc>
+              <w:tc>
+                <w:tcPr>
+                  <w:tcW w:w="1275" w:type="dxa"/>
+                </w:tcPr>
+                <w:p>
+                  <w:pPr>
+                    <w:jc w:val="center"/>
+                    <w:rPr>
+                      <w:rFonts w:ascii="Aptos Display" w:eastAsia="Arial" w:hAnsi="Aptos Display" w:cs="Arial"/>
+                      <w:b/>
+                      <w:spacing w:val="-3"/>
+                      <w:sz w:val="22"/>
+                      <w:szCs w:val="22"/>
+                      <w:lang w:val="id-ID"/>
+                    </w:rPr>
+                  </w:pPr>
+                </w:p>
+              </w:tc>
+              <w:tc>
+                <w:tcPr>
+                  <w:tcW w:w="1701" w:type="dxa"/>
+                </w:tcPr>
+                <w:p>
+                  <w:pPr>
+                    <w:jc w:val="center"/>
+                    <w:rPr>
+                      <w:rFonts w:ascii="Aptos Display" w:eastAsia="Arial" w:hAnsi="Aptos Display" w:cs="Arial"/>
+                      <w:b/>
+                      <w:spacing w:val="-3"/>
+                      <w:sz w:val="22"/>
+                      <w:szCs w:val="22"/>
+                      <w:lang w:val="id-ID"/>
+                    </w:rPr>
+                  </w:pPr>
+                </w:p>
+              </w:tc>
+              <w:tc>
+                <w:tcPr>
+                  <w:tcW w:w="1418" w:type="dxa"/>
                 </w:tcPr>
                 <w:p>
                   <w:pPr>
@@ -4573,79 +4640,7 @@
               </w:tc>
               <w:tc>
                 <w:tcPr>
-                  <w:tcW w:w="856" w:type="dxa"/>
-                </w:tcPr>
-                <w:p>
-                  <w:pPr>
-                    <w:jc w:val="center"/>
-                    <w:rPr>
-                      <w:rFonts w:ascii="Aptos Display" w:eastAsia="Arial" w:hAnsi="Aptos Display" w:cs="Arial"/>
-                      <w:b/>
-                      <w:spacing w:val="-3"/>
-                      <w:sz w:val="22"/>
-                      <w:szCs w:val="22"/>
-                      <w:lang w:val="id-ID"/>
-                    </w:rPr>
-                  </w:pPr>
-                </w:p>
-              </w:tc>
-              <w:tc>
-                <w:tcPr>
-                  <w:tcW w:w="1417" w:type="dxa"/>
-                </w:tcPr>
-                <w:p>
-                  <w:pPr>
-                    <w:jc w:val="center"/>
-                    <w:rPr>
-                      <w:rFonts w:ascii="Aptos Display" w:eastAsia="Arial" w:hAnsi="Aptos Display" w:cs="Arial"/>
-                      <w:b/>
-                      <w:spacing w:val="-3"/>
-                      <w:sz w:val="22"/>
-                      <w:szCs w:val="22"/>
-                      <w:lang w:val="id-ID"/>
-                    </w:rPr>
-                  </w:pPr>
-                </w:p>
-              </w:tc>
-              <w:tc>
-                <w:tcPr>
-                  <w:tcW w:w="1838" w:type="dxa"/>
-                </w:tcPr>
-                <w:p>
-                  <w:pPr>
-                    <w:jc w:val="center"/>
-                    <w:rPr>
-                      <w:rFonts w:ascii="Aptos Display" w:eastAsia="Arial" w:hAnsi="Aptos Display" w:cs="Arial"/>
-                      <w:b/>
-                      <w:spacing w:val="-3"/>
-                      <w:sz w:val="22"/>
-                      <w:szCs w:val="22"/>
-                      <w:lang w:val="id-ID"/>
-                    </w:rPr>
-                  </w:pPr>
-                </w:p>
-              </w:tc>
-              <w:tc>
-                <w:tcPr>
-                  <w:tcW w:w="1559" w:type="dxa"/>
-                </w:tcPr>
-                <w:p>
-                  <w:pPr>
-                    <w:jc w:val="center"/>
-                    <w:rPr>
-                      <w:rFonts w:ascii="Aptos Display" w:eastAsia="Arial" w:hAnsi="Aptos Display" w:cs="Arial"/>
-                      <w:b/>
-                      <w:spacing w:val="-3"/>
-                      <w:sz w:val="22"/>
-                      <w:szCs w:val="22"/>
-                      <w:lang w:val="id-ID"/>
-                    </w:rPr>
-                  </w:pPr>
-                </w:p>
-              </w:tc>
-              <w:tc>
-                <w:tcPr>
-                  <w:tcW w:w="1559" w:type="dxa"/>
+                  <w:tcW w:w="1134" w:type="dxa"/>
                 </w:tcPr>
                 <w:p>
                   <w:pPr>

</xml_diff>